<commit_message>
adaptshrink manuscript: add magnesium/MI real ground-truth external-validity boundary (honest)
Folds the 2nd real-dataset external-validity result into AdaptShrink_StatMed section 5: on the
magnesium/MI case (dat.li2007, ISIS-4+MAGIC mega-trial truth OR~1.05) no corrector recovers the null;
AdaptShrink-solo moves right (+26%) but PET closest (+34%); ensemble under-moves (+4%) as trim-fill+V-H
misfire -> solo preferable on adversarial cases. Boundary not a win, reported honestly. Data staged
reproducibly (examples/li2007_magnesium.csv + provenance); script now reads the repo copy. docx
rebuilt+validated (magnesium present, no leaks).

Co-Authored-By: Claude Opus 4.8 (1M context) <noreply@anthropic.com>
</commit_message>
<xml_diff>
--- a/manuscript/AdaptShrink_StatMed.docx
+++ b/manuscript/AdaptShrink_StatMed.docx
@@ -1097,6 +1097,21 @@
       </w:r>
       <w:r>
         <w:t xml:space="preserve">(i) Eased deployable coverage: on the hard continuous grid auto’s mean deployable coverage is 0.843 (0.938 on log-OR); at high τ its off-the-shelf interval can under-cover, so users should treat the interval as somewhat optimistic and report τ̂. (ii) The trim-and-fill metric artefact: several of auto’s losses are to trim-and-fill on the oracle MCIW0 metric in step/Copas cells — hollow, because trim-and-fill’s deployable coverage is ≈ 0.29; it is not a deployable competitor. (iii) Null + step centre bias: when the true effect is zero under strong step selection the bias correction over-corrects downward; a symmetric interval cannot repair this.</w:t>
+      </w:r>
+    </w:p>
+    <w:p>
+      <w:pPr>
+        <w:spacing w:after="120" w:line="276"/>
+      </w:pPr>
+      <w:r>
+        <w:rPr>
+          <w:b/>
+          <w:bCs/>
+        </w:rPr>
+        <w:t xml:space="preserve">A second real dataset — magnesium/MI, an adversarial boundary. </w:t>
+      </w:r>
+      <w:r>
+        <w:t xml:space="preserve">We also ran the estimator on the classic magnesium-for-MI meta-analysis (metadat::dat.li2007; examples/li2007_magnesium.csv; truth-recovery/magnesium_realtest.py), which has a rare external ground truth: after 20 small trials suggested a large mortality benefit, the ISIS-4 (N=58,050) and MAGIC (N=6,213) mega-trials found essentially no effect (pooled log-OR +0.05, OR 1.05). Pooling the 20 small trials and asking each estimator to move the spurious benefit (naive DL OR 0.61) toward that truth is a demanding test, reported honestly. No corrector reaches the mega-trial null — the magnesium small-study effect is famously more than publication selection (era/quality confounding), so it is adversarial for any funnel-based method. AdaptShrink-solo moves the right way (+26% closer, OR 0.70) but is not the closest; PET-PEESE is (+34%, OR 0.73) — on a single k=20 funnel PET has enough studies to behave, unlike its instability on few-studies-per-contrast networks. The AdaptShrink ensemble under-moves here (+4%) because two members (trim-and-fill, Vevea–Hedges) misfire on this dataset and dilute PET's correct pull: robust averaging is only as safe as the majority of its members, so on an adversarial case AdaptShrink-solo is preferable. A boundary, not a win — a non-selection bias defeats all funnel correctors, and the ensemble's safety is contingent on member agreement.</w:t>
       </w:r>
     </w:p>
     <w:p>

</xml_diff>